<commit_message>
Add report with 1 DB 0 VN middleware
</commit_message>
<xml_diff>
--- a/Documentation/Word_Draft.docx
+++ b/Documentation/Word_Draft.docx
@@ -4938,7 +4938,15 @@
         <w:t xml:space="preserve"> </w:t>
       </w:r>
       <w:r>
-        <w:t xml:space="preserve">is a time duration between the initiation of a request transmission by a source and the reception of the corresponding message by the destination. Such latency manifests as the time in which the request is held in a waiting state prior to processing. Round-trip latency, whereas, is defined as time elapsed between the transmission of a request and the receipt of the corresponding response. It does not account for the processing time incurred at the destination. </w:t>
+        <w:t xml:space="preserve">is </w:t>
+      </w:r>
+      <w:proofErr w:type="gramStart"/>
+      <w:r>
+        <w:t>a time</w:t>
+      </w:r>
+      <w:proofErr w:type="gramEnd"/>
+      <w:r>
+        <w:t xml:space="preserve"> duration between the initiation of a request transmission by a source and the reception of the corresponding message by the destination. Such latency manifests as the time in which the request is held in a waiting state prior to processing. Round-trip latency, whereas, is defined as time elapsed between the transmission of a request and the receipt of the corresponding response. It does not account for the processing time incurred at the destination. </w:t>
       </w:r>
     </w:p>
     <w:p>
@@ -5061,6 +5069,22 @@
         <w:t>Without Middleware:</w:t>
       </w:r>
     </w:p>
+    <w:p>
+      <w:r>
+        <w:t xml:space="preserve">Configurations: </w:t>
+      </w:r>
+    </w:p>
+    <w:p>
+      <w:r>
+        <w:t>Database Node = 1</w:t>
+      </w:r>
+    </w:p>
+    <w:p>
+      <w:r>
+        <w:t>Virtual Nodes = 0</w:t>
+      </w:r>
+    </w:p>
+    <w:p/>
     <w:p/>
     <w:p>
       <w:r>
@@ -5257,7 +5281,7 @@
           </mc:Choice>
           <mc:Fallback>
             <w:pict>
-              <v:group w14:anchorId="0BE8ED56" id="Group 4" o:spid="_x0000_s1026" style="position:absolute;margin-left:0;margin-top:226.55pt;width:519.25pt;height:194.65pt;z-index:251659264;mso-position-horizontal:center;mso-position-horizontal-relative:margin" coordsize="65945,24725" o:gfxdata="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">
+              <v:group w14:anchorId="6A36112D" id="Group 4" o:spid="_x0000_s1026" style="position:absolute;margin-left:0;margin-top:226.55pt;width:519.25pt;height:194.65pt;z-index:251659264;mso-position-horizontal:center;mso-position-horizontal-relative:margin" coordsize="65945,24725" o:gfxdata="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">
                 <v:shapetype id="_x0000_t75" coordsize="21600,21600" o:spt="75" o:preferrelative="t" path="m@4@5l@4@11@9@11@9@5xe" filled="f" stroked="f">
                   <v:stroke joinstyle="miter"/>
                   <v:formulas>
@@ -5401,7 +5425,7 @@
           </mc:Choice>
           <mc:Fallback>
             <w:pict>
-              <v:group w14:anchorId="11340855" id="Group 2" o:spid="_x0000_s1026" style="position:absolute;margin-left:0;margin-top:.05pt;width:519.55pt;height:194.7pt;z-index:251661312;mso-position-horizontal:center;mso-position-horizontal-relative:margin" coordsize="65983,24725" o:gfxdata="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">
+              <v:group w14:anchorId="6BB37781" id="Group 2" o:spid="_x0000_s1026" style="position:absolute;margin-left:0;margin-top:.05pt;width:519.55pt;height:194.7pt;z-index:251661312;mso-position-horizontal:center;mso-position-horizontal-relative:margin" coordsize="65983,24725" o:gfxdata="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">
                 <v:shape id="Graphic 9" o:spid="_x0000_s1027" type="#_x0000_t75" style="position:absolute;top:36;width:32886;height:24689;visibility:visible;mso-wrap-style:square" o:gfxdata="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">
                   <v:imagedata r:id="rId27" o:title=""/>
                 </v:shape>
@@ -5431,8 +5455,103 @@
         <w:t xml:space="preserve">  </w:t>
       </w:r>
     </w:p>
-    <w:p/>
-    <w:p/>
+    <w:p>
+      <w:r>
+        <w:lastRenderedPageBreak/>
+        <w:br w:type="page"/>
+      </w:r>
+    </w:p>
+    <w:p>
+      <w:r>
+        <w:lastRenderedPageBreak/>
+        <w:t>With Middleware</w:t>
+      </w:r>
+      <w:r>
+        <w:t>:</w:t>
+      </w:r>
+    </w:p>
+    <w:p>
+      <w:pPr>
+        <w:pStyle w:val="NormalWeb"/>
+        <w:rPr>
+          <w:rFonts w:asciiTheme="minorHAnsi" w:hAnsiTheme="minorHAnsi" w:cstheme="minorHAnsi"/>
+          <w:sz w:val="22"/>
+          <w:szCs w:val="22"/>
+        </w:rPr>
+      </w:pPr>
+      <w:r>
+        <w:rPr>
+          <w:rFonts w:asciiTheme="minorHAnsi" w:hAnsiTheme="minorHAnsi" w:cstheme="minorHAnsi"/>
+          <w:sz w:val="22"/>
+          <w:szCs w:val="22"/>
+        </w:rPr>
+        <w:t xml:space="preserve">The benchmark configuration involves </w:t>
+      </w:r>
+      <w:r>
+        <w:rPr>
+          <w:rFonts w:asciiTheme="minorHAnsi" w:hAnsiTheme="minorHAnsi" w:cstheme="minorHAnsi"/>
+          <w:sz w:val="22"/>
+          <w:szCs w:val="22"/>
+        </w:rPr>
+        <w:t xml:space="preserve">the middleware having </w:t>
+      </w:r>
+      <w:r>
+        <w:rPr>
+          <w:rFonts w:asciiTheme="minorHAnsi" w:hAnsiTheme="minorHAnsi" w:cstheme="minorHAnsi"/>
+          <w:sz w:val="22"/>
+          <w:szCs w:val="22"/>
+        </w:rPr>
+        <w:t xml:space="preserve">a single database node with no virtual nodes and a simulated load of 100 concurrent </w:t>
+      </w:r>
+      <w:r>
+        <w:rPr>
+          <w:rFonts w:asciiTheme="minorHAnsi" w:hAnsiTheme="minorHAnsi" w:cstheme="minorHAnsi"/>
+          <w:sz w:val="22"/>
+          <w:szCs w:val="22"/>
+        </w:rPr>
+        <w:t>clients</w:t>
+      </w:r>
+      <w:r>
+        <w:rPr>
+          <w:rFonts w:asciiTheme="minorHAnsi" w:hAnsiTheme="minorHAnsi" w:cstheme="minorHAnsi"/>
+          <w:sz w:val="22"/>
+          <w:szCs w:val="22"/>
+        </w:rPr>
+        <w:t xml:space="preserve">. The test begins with one </w:t>
+      </w:r>
+      <w:r>
+        <w:rPr>
+          <w:rFonts w:asciiTheme="minorHAnsi" w:hAnsiTheme="minorHAnsi" w:cstheme="minorHAnsi"/>
+          <w:sz w:val="22"/>
+          <w:szCs w:val="22"/>
+        </w:rPr>
+        <w:t>client</w:t>
+      </w:r>
+      <w:r>
+        <w:rPr>
+          <w:rFonts w:asciiTheme="minorHAnsi" w:hAnsiTheme="minorHAnsi" w:cstheme="minorHAnsi"/>
+          <w:sz w:val="22"/>
+          <w:szCs w:val="22"/>
+        </w:rPr>
+        <w:t xml:space="preserve"> and gradually increases the load with a spawn rate of 10 </w:t>
+      </w:r>
+      <w:r>
+        <w:rPr>
+          <w:rFonts w:asciiTheme="minorHAnsi" w:hAnsiTheme="minorHAnsi" w:cstheme="minorHAnsi"/>
+          <w:sz w:val="22"/>
+          <w:szCs w:val="22"/>
+        </w:rPr>
+        <w:t>clients</w:t>
+      </w:r>
+      <w:r>
+        <w:rPr>
+          <w:rFonts w:asciiTheme="minorHAnsi" w:hAnsiTheme="minorHAnsi" w:cstheme="minorHAnsi"/>
+          <w:sz w:val="22"/>
+          <w:szCs w:val="22"/>
+        </w:rPr>
+        <w:t xml:space="preserve"> per second. The benchmark runtime is set to 120 seconds, during which the system performance will be evaluated under the given workload.</w:t>
+      </w:r>
+    </w:p>
     <w:p/>
     <w:tbl>
       <w:tblPr>
@@ -5469,7 +5588,6 @@
                 <w:b/>
                 <w:bCs/>
               </w:rPr>
-              <w:lastRenderedPageBreak/>
               <w:t>Operations</w:t>
             </w:r>
             <w:r>
@@ -5605,6 +5723,9 @@
             <w:pPr>
               <w:jc w:val="center"/>
             </w:pPr>
+            <w:r>
+              <w:t>2008</w:t>
+            </w:r>
           </w:p>
         </w:tc>
         <w:tc>
@@ -5615,6 +5736,9 @@
             <w:pPr>
               <w:jc w:val="center"/>
             </w:pPr>
+            <w:r>
+              <w:t>0</w:t>
+            </w:r>
           </w:p>
         </w:tc>
         <w:tc>
@@ -5624,6 +5748,22 @@
           <w:p>
             <w:pPr>
               <w:jc w:val="center"/>
+              <w:rPr>
+                <w:rFonts w:ascii="Calibri" w:hAnsi="Calibri" w:cs="Calibri"/>
+                <w:color w:val="000000"/>
+              </w:rPr>
+            </w:pPr>
+            <w:r>
+              <w:rPr>
+                <w:rFonts w:ascii="Calibri" w:hAnsi="Calibri" w:cs="Calibri"/>
+                <w:color w:val="000000"/>
+              </w:rPr>
+              <w:t>16.73515</w:t>
+            </w:r>
+          </w:p>
+          <w:p>
+            <w:pPr>
+              <w:jc w:val="center"/>
             </w:pPr>
           </w:p>
         </w:tc>
@@ -5635,6 +5775,9 @@
             <w:pPr>
               <w:jc w:val="center"/>
             </w:pPr>
+            <w:r>
+              <w:t>4</w:t>
+            </w:r>
           </w:p>
         </w:tc>
       </w:tr>
@@ -5676,28 +5819,7 @@
                 <w:b/>
                 <w:bCs/>
               </w:rPr>
-              <w:t xml:space="preserve">(Multiple </w:t>
-            </w:r>
-            <w:r>
-              <w:rPr>
-                <w:b/>
-                <w:bCs/>
-              </w:rPr>
-              <w:t>Key-Value Pair</w:t>
-            </w:r>
-            <w:r>
-              <w:rPr>
-                <w:b/>
-                <w:bCs/>
-              </w:rPr>
-              <w:t>s</w:t>
-            </w:r>
-            <w:r>
-              <w:rPr>
-                <w:b/>
-                <w:bCs/>
-              </w:rPr>
-              <w:t>)</w:t>
+              <w:t>(Multiple Key-Value Pairs)</w:t>
             </w:r>
           </w:p>
         </w:tc>
@@ -5708,6 +5830,22 @@
           <w:p>
             <w:pPr>
               <w:jc w:val="center"/>
+              <w:rPr>
+                <w:rFonts w:ascii="Calibri" w:hAnsi="Calibri" w:cs="Calibri"/>
+                <w:color w:val="000000"/>
+              </w:rPr>
+            </w:pPr>
+            <w:r>
+              <w:rPr>
+                <w:rFonts w:ascii="Calibri" w:hAnsi="Calibri" w:cs="Calibri"/>
+                <w:color w:val="000000"/>
+              </w:rPr>
+              <w:t>2009</w:t>
+            </w:r>
+          </w:p>
+          <w:p>
+            <w:pPr>
+              <w:jc w:val="center"/>
             </w:pPr>
           </w:p>
         </w:tc>
@@ -5719,6 +5857,9 @@
             <w:pPr>
               <w:jc w:val="center"/>
             </w:pPr>
+            <w:r>
+              <w:t>0</w:t>
+            </w:r>
           </w:p>
         </w:tc>
         <w:tc>
@@ -5728,6 +5869,22 @@
           <w:p>
             <w:pPr>
               <w:jc w:val="center"/>
+              <w:rPr>
+                <w:rFonts w:ascii="Calibri" w:hAnsi="Calibri" w:cs="Calibri"/>
+                <w:color w:val="000000"/>
+              </w:rPr>
+            </w:pPr>
+            <w:r>
+              <w:rPr>
+                <w:rFonts w:ascii="Calibri" w:hAnsi="Calibri" w:cs="Calibri"/>
+                <w:color w:val="000000"/>
+              </w:rPr>
+              <w:t>16.74348</w:t>
+            </w:r>
+          </w:p>
+          <w:p>
+            <w:pPr>
+              <w:jc w:val="center"/>
             </w:pPr>
           </w:p>
         </w:tc>
@@ -5739,6 +5896,9 @@
             <w:pPr>
               <w:jc w:val="center"/>
             </w:pPr>
+            <w:r>
+              <w:t>4</w:t>
+            </w:r>
           </w:p>
         </w:tc>
       </w:tr>
@@ -5764,14 +5924,7 @@
                 <w:b/>
                 <w:bCs/>
               </w:rPr>
-              <w:t>Get</w:t>
-            </w:r>
-            <w:r>
-              <w:rPr>
-                <w:b/>
-                <w:bCs/>
-              </w:rPr>
-              <w:t xml:space="preserve"> Function (Single Key-Value Pair)</w:t>
+              <w:t>Get Function (Single Key-Value Pair)</w:t>
             </w:r>
           </w:p>
         </w:tc>
@@ -5782,6 +5935,22 @@
           <w:p>
             <w:pPr>
               <w:jc w:val="center"/>
+              <w:rPr>
+                <w:rFonts w:ascii="Calibri" w:hAnsi="Calibri" w:cs="Calibri"/>
+                <w:color w:val="000000"/>
+              </w:rPr>
+            </w:pPr>
+            <w:r>
+              <w:rPr>
+                <w:rFonts w:ascii="Calibri" w:hAnsi="Calibri" w:cs="Calibri"/>
+                <w:color w:val="000000"/>
+              </w:rPr>
+              <w:t>2008</w:t>
+            </w:r>
+          </w:p>
+          <w:p>
+            <w:pPr>
+              <w:jc w:val="center"/>
             </w:pPr>
           </w:p>
         </w:tc>
@@ -5793,6 +5962,9 @@
             <w:pPr>
               <w:jc w:val="center"/>
             </w:pPr>
+            <w:r>
+              <w:t>0</w:t>
+            </w:r>
           </w:p>
         </w:tc>
         <w:tc>
@@ -5802,6 +5974,22 @@
           <w:p>
             <w:pPr>
               <w:jc w:val="center"/>
+              <w:rPr>
+                <w:rFonts w:ascii="Calibri" w:hAnsi="Calibri" w:cs="Calibri"/>
+                <w:color w:val="000000"/>
+              </w:rPr>
+            </w:pPr>
+            <w:r>
+              <w:rPr>
+                <w:rFonts w:ascii="Calibri" w:hAnsi="Calibri" w:cs="Calibri"/>
+                <w:color w:val="000000"/>
+              </w:rPr>
+              <w:t>16.73515</w:t>
+            </w:r>
+          </w:p>
+          <w:p>
+            <w:pPr>
+              <w:jc w:val="center"/>
             </w:pPr>
           </w:p>
         </w:tc>
@@ -5809,6 +5997,22 @@
           <w:tcPr>
             <w:tcW w:w="1789" w:type="dxa"/>
           </w:tcPr>
+          <w:p>
+            <w:pPr>
+              <w:jc w:val="center"/>
+              <w:rPr>
+                <w:rFonts w:ascii="Calibri" w:hAnsi="Calibri" w:cs="Calibri"/>
+                <w:color w:val="000000"/>
+              </w:rPr>
+            </w:pPr>
+            <w:r>
+              <w:rPr>
+                <w:rFonts w:ascii="Calibri" w:hAnsi="Calibri" w:cs="Calibri"/>
+                <w:color w:val="000000"/>
+              </w:rPr>
+              <w:t>11.201</w:t>
+            </w:r>
+          </w:p>
           <w:p>
             <w:pPr>
               <w:jc w:val="center"/>
@@ -5838,49 +6042,2116 @@
                 <w:b/>
                 <w:bCs/>
               </w:rPr>
-              <w:t xml:space="preserve">Get </w:t>
-            </w:r>
-            <w:r>
-              <w:rPr>
-                <w:b/>
-                <w:bCs/>
-              </w:rPr>
-              <w:t>Function</w:t>
-            </w:r>
-            <w:r>
-              <w:rPr>
-                <w:b/>
-                <w:bCs/>
-              </w:rPr>
-              <w:t xml:space="preserve"> (</w:t>
-            </w:r>
-            <w:r>
-              <w:rPr>
-                <w:b/>
-                <w:bCs/>
-              </w:rPr>
-              <w:t>Multiple</w:t>
-            </w:r>
-            <w:r>
-              <w:rPr>
-                <w:b/>
-                <w:bCs/>
-              </w:rPr>
-              <w:t xml:space="preserve"> Key-Value Pair</w:t>
-            </w:r>
-            <w:r>
-              <w:rPr>
-                <w:b/>
-                <w:bCs/>
-              </w:rPr>
-              <w:t>s</w:t>
-            </w:r>
+              <w:t xml:space="preserve">Get-Range Function (Range </w:t>
+            </w:r>
+            <w:proofErr w:type="gramStart"/>
+            <w:r>
+              <w:rPr>
+                <w:b/>
+                <w:bCs/>
+              </w:rPr>
+              <w:t>Of</w:t>
+            </w:r>
+            <w:proofErr w:type="gramEnd"/>
+            <w:r>
+              <w:rPr>
+                <w:b/>
+                <w:bCs/>
+              </w:rPr>
+              <w:t xml:space="preserve"> Key-Value Pairs)</w:t>
+            </w:r>
+          </w:p>
+        </w:tc>
+        <w:tc>
+          <w:tcPr>
+            <w:tcW w:w="1710" w:type="dxa"/>
+          </w:tcPr>
+          <w:p>
+            <w:pPr>
+              <w:jc w:val="center"/>
+            </w:pPr>
+            <w:r>
+              <w:t>1972</w:t>
+            </w:r>
+          </w:p>
+        </w:tc>
+        <w:tc>
+          <w:tcPr>
+            <w:tcW w:w="1800" w:type="dxa"/>
+          </w:tcPr>
+          <w:p>
+            <w:pPr>
+              <w:jc w:val="center"/>
+            </w:pPr>
+            <w:r>
+              <w:t>0</w:t>
+            </w:r>
+          </w:p>
+        </w:tc>
+        <w:tc>
+          <w:tcPr>
+            <w:tcW w:w="1800" w:type="dxa"/>
+          </w:tcPr>
+          <w:p>
+            <w:pPr>
+              <w:jc w:val="center"/>
+              <w:rPr>
+                <w:rFonts w:ascii="Calibri" w:hAnsi="Calibri" w:cs="Calibri"/>
+                <w:color w:val="000000"/>
+              </w:rPr>
+            </w:pPr>
+            <w:r>
+              <w:rPr>
+                <w:rFonts w:ascii="Calibri" w:hAnsi="Calibri" w:cs="Calibri"/>
+                <w:color w:val="000000"/>
+              </w:rPr>
+              <w:t>16.43511</w:t>
+            </w:r>
+          </w:p>
+          <w:p>
+            <w:pPr>
+              <w:jc w:val="center"/>
+            </w:pPr>
+          </w:p>
+        </w:tc>
+        <w:tc>
+          <w:tcPr>
+            <w:tcW w:w="1789" w:type="dxa"/>
+          </w:tcPr>
+          <w:p>
+            <w:pPr>
+              <w:jc w:val="center"/>
+              <w:rPr>
+                <w:rFonts w:ascii="Calibri" w:hAnsi="Calibri" w:cs="Calibri"/>
+                <w:color w:val="000000"/>
+              </w:rPr>
+            </w:pPr>
+            <w:r>
+              <w:rPr>
+                <w:rFonts w:ascii="Calibri" w:hAnsi="Calibri" w:cs="Calibri"/>
+                <w:color w:val="000000"/>
+              </w:rPr>
+              <w:t>3569.5</w:t>
+            </w:r>
+          </w:p>
+          <w:p>
+            <w:pPr>
+              <w:jc w:val="center"/>
+            </w:pPr>
+          </w:p>
+        </w:tc>
+      </w:tr>
+      <w:tr>
+        <w:trPr>
+          <w:trHeight w:val="305"/>
+        </w:trPr>
+        <w:tc>
+          <w:tcPr>
+            <w:tcW w:w="2425" w:type="dxa"/>
+            <w:shd w:val="clear" w:color="auto" w:fill="E2EFD9" w:themeFill="accent6" w:themeFillTint="33"/>
+          </w:tcPr>
+          <w:p>
+            <w:pPr>
+              <w:jc w:val="center"/>
+              <w:rPr>
+                <w:b/>
+                <w:bCs/>
+              </w:rPr>
+            </w:pPr>
+            <w:r>
+              <w:rPr>
+                <w:b/>
+                <w:bCs/>
+              </w:rPr>
+              <w:t>Get Function (Multiple Key-Value Pairs)</w:t>
+            </w:r>
+          </w:p>
+        </w:tc>
+        <w:tc>
+          <w:tcPr>
+            <w:tcW w:w="1710" w:type="dxa"/>
+          </w:tcPr>
+          <w:p>
+            <w:pPr>
+              <w:jc w:val="center"/>
+              <w:rPr>
+                <w:rFonts w:ascii="Calibri" w:hAnsi="Calibri" w:cs="Calibri"/>
+                <w:color w:val="000000"/>
+              </w:rPr>
+            </w:pPr>
+            <w:r>
+              <w:rPr>
+                <w:rFonts w:ascii="Calibri" w:hAnsi="Calibri" w:cs="Calibri"/>
+                <w:color w:val="000000"/>
+              </w:rPr>
+              <w:t>1944</w:t>
+            </w:r>
+          </w:p>
+          <w:p>
+            <w:pPr>
+              <w:jc w:val="center"/>
+            </w:pPr>
+          </w:p>
+        </w:tc>
+        <w:tc>
+          <w:tcPr>
+            <w:tcW w:w="1800" w:type="dxa"/>
+          </w:tcPr>
+          <w:p>
+            <w:pPr>
+              <w:jc w:val="center"/>
+            </w:pPr>
+            <w:r>
+              <w:t>0</w:t>
+            </w:r>
+          </w:p>
+        </w:tc>
+        <w:tc>
+          <w:tcPr>
+            <w:tcW w:w="1800" w:type="dxa"/>
+          </w:tcPr>
+          <w:p>
+            <w:pPr>
+              <w:jc w:val="center"/>
+              <w:rPr>
+                <w:rFonts w:ascii="Calibri" w:hAnsi="Calibri" w:cs="Calibri"/>
+                <w:color w:val="000000"/>
+              </w:rPr>
+            </w:pPr>
+            <w:r>
+              <w:rPr>
+                <w:rFonts w:ascii="Calibri" w:hAnsi="Calibri" w:cs="Calibri"/>
+                <w:color w:val="000000"/>
+              </w:rPr>
+              <w:t>16.20176</w:t>
+            </w:r>
+          </w:p>
+          <w:p>
+            <w:pPr>
+              <w:jc w:val="center"/>
+            </w:pPr>
+          </w:p>
+        </w:tc>
+        <w:tc>
+          <w:tcPr>
+            <w:tcW w:w="1789" w:type="dxa"/>
+          </w:tcPr>
+          <w:p>
+            <w:pPr>
+              <w:jc w:val="center"/>
+              <w:rPr>
+                <w:rFonts w:ascii="Calibri" w:hAnsi="Calibri" w:cs="Calibri"/>
+                <w:color w:val="000000"/>
+              </w:rPr>
+            </w:pPr>
+            <w:r>
+              <w:rPr>
+                <w:rFonts w:ascii="Calibri" w:hAnsi="Calibri" w:cs="Calibri"/>
+                <w:color w:val="000000"/>
+              </w:rPr>
+              <w:t>5690.9</w:t>
+            </w:r>
+          </w:p>
+          <w:p>
+            <w:pPr>
+              <w:jc w:val="center"/>
+            </w:pPr>
+          </w:p>
+        </w:tc>
+      </w:tr>
+      <w:tr>
+        <w:trPr>
+          <w:trHeight w:val="305"/>
+        </w:trPr>
+        <w:tc>
+          <w:tcPr>
+            <w:tcW w:w="2425" w:type="dxa"/>
+            <w:shd w:val="clear" w:color="auto" w:fill="E2EFD9" w:themeFill="accent6" w:themeFillTint="33"/>
+          </w:tcPr>
+          <w:p>
+            <w:pPr>
+              <w:jc w:val="center"/>
+              <w:rPr>
+                <w:b/>
+                <w:bCs/>
+              </w:rPr>
+            </w:pPr>
+            <w:r>
+              <w:rPr>
+                <w:b/>
+                <w:bCs/>
+              </w:rPr>
+              <w:t>Delete Function (Single/Multiple Key-Value Pairs)</w:t>
+            </w:r>
+          </w:p>
+        </w:tc>
+        <w:tc>
+          <w:tcPr>
+            <w:tcW w:w="1710" w:type="dxa"/>
+          </w:tcPr>
+          <w:p>
+            <w:pPr>
+              <w:jc w:val="center"/>
+              <w:rPr>
+                <w:rFonts w:ascii="Calibri" w:hAnsi="Calibri" w:cs="Calibri"/>
+                <w:color w:val="000000"/>
+              </w:rPr>
+            </w:pPr>
+            <w:r>
+              <w:rPr>
+                <w:rFonts w:ascii="Calibri" w:hAnsi="Calibri" w:cs="Calibri"/>
+                <w:color w:val="000000"/>
+              </w:rPr>
+              <w:t>2013</w:t>
+            </w:r>
+          </w:p>
+          <w:p>
+            <w:pPr>
+              <w:jc w:val="center"/>
+            </w:pPr>
+          </w:p>
+        </w:tc>
+        <w:tc>
+          <w:tcPr>
+            <w:tcW w:w="1800" w:type="dxa"/>
+          </w:tcPr>
+          <w:p>
+            <w:pPr>
+              <w:jc w:val="center"/>
+            </w:pPr>
+            <w:r>
+              <w:t>0</w:t>
+            </w:r>
+          </w:p>
+        </w:tc>
+        <w:tc>
+          <w:tcPr>
+            <w:tcW w:w="1800" w:type="dxa"/>
+          </w:tcPr>
+          <w:p>
+            <w:pPr>
+              <w:jc w:val="center"/>
+              <w:rPr>
+                <w:rFonts w:ascii="Calibri" w:hAnsi="Calibri" w:cs="Calibri"/>
+                <w:color w:val="000000"/>
+              </w:rPr>
+            </w:pPr>
+            <w:r>
+              <w:rPr>
+                <w:rFonts w:ascii="Calibri" w:hAnsi="Calibri" w:cs="Calibri"/>
+                <w:color w:val="000000"/>
+              </w:rPr>
+              <w:t>16.77682</w:t>
+            </w:r>
+          </w:p>
+          <w:p>
+            <w:pPr>
+              <w:jc w:val="center"/>
+            </w:pPr>
+          </w:p>
+        </w:tc>
+        <w:tc>
+          <w:tcPr>
+            <w:tcW w:w="1789" w:type="dxa"/>
+          </w:tcPr>
+          <w:p>
+            <w:pPr>
+              <w:jc w:val="center"/>
+            </w:pPr>
+            <w:r>
+              <w:t>4</w:t>
+            </w:r>
+          </w:p>
+        </w:tc>
+      </w:tr>
+      <w:tr>
+        <w:trPr>
+          <w:trHeight w:val="305"/>
+        </w:trPr>
+        <w:tc>
+          <w:tcPr>
+            <w:tcW w:w="2425" w:type="dxa"/>
+            <w:shd w:val="clear" w:color="auto" w:fill="E2EFD9" w:themeFill="accent6" w:themeFillTint="33"/>
+          </w:tcPr>
+          <w:p>
+            <w:pPr>
+              <w:jc w:val="center"/>
+              <w:rPr>
+                <w:b/>
+                <w:bCs/>
+              </w:rPr>
+            </w:pPr>
+            <w:r>
+              <w:rPr>
+                <w:b/>
+                <w:bCs/>
+              </w:rPr>
+              <w:t>Aggregated</w:t>
+            </w:r>
+          </w:p>
+        </w:tc>
+        <w:tc>
+          <w:tcPr>
+            <w:tcW w:w="1710" w:type="dxa"/>
+          </w:tcPr>
+          <w:p>
+            <w:pPr>
+              <w:jc w:val="center"/>
+              <w:rPr>
+                <w:rFonts w:ascii="Calibri" w:hAnsi="Calibri" w:cs="Calibri"/>
+                <w:color w:val="000000"/>
+              </w:rPr>
+            </w:pPr>
+            <w:r>
+              <w:rPr>
+                <w:rFonts w:ascii="Calibri" w:hAnsi="Calibri" w:cs="Calibri"/>
+                <w:color w:val="000000"/>
+              </w:rPr>
+              <w:fldChar w:fldCharType="begin"/>
+            </w:r>
+            <w:r>
+              <w:rPr>
+                <w:rFonts w:ascii="Calibri" w:hAnsi="Calibri" w:cs="Calibri"/>
+                <w:color w:val="000000"/>
+              </w:rPr>
+              <w:instrText xml:space="preserve"> =SUM(ABOVE) </w:instrText>
+            </w:r>
+            <w:r>
+              <w:rPr>
+                <w:rFonts w:ascii="Calibri" w:hAnsi="Calibri" w:cs="Calibri"/>
+                <w:color w:val="000000"/>
+              </w:rPr>
+              <w:fldChar w:fldCharType="separate"/>
+            </w:r>
+            <w:r>
+              <w:rPr>
+                <w:rFonts w:ascii="Calibri" w:hAnsi="Calibri" w:cs="Calibri"/>
+                <w:noProof/>
+                <w:color w:val="000000"/>
+              </w:rPr>
+              <w:t>11954</w:t>
+            </w:r>
+            <w:r>
+              <w:rPr>
+                <w:rFonts w:ascii="Calibri" w:hAnsi="Calibri" w:cs="Calibri"/>
+                <w:color w:val="000000"/>
+              </w:rPr>
+              <w:fldChar w:fldCharType="end"/>
+            </w:r>
+          </w:p>
+        </w:tc>
+        <w:tc>
+          <w:tcPr>
+            <w:tcW w:w="1800" w:type="dxa"/>
+          </w:tcPr>
+          <w:p>
+            <w:pPr>
+              <w:jc w:val="center"/>
+            </w:pPr>
+            <w:r>
+              <w:fldChar w:fldCharType="begin"/>
+            </w:r>
+            <w:r>
+              <w:instrText xml:space="preserve"> =SUM(ABOVE) </w:instrText>
+            </w:r>
+            <w:r>
+              <w:fldChar w:fldCharType="separate"/>
+            </w:r>
+            <w:r>
+              <w:rPr>
+                <w:noProof/>
+              </w:rPr>
+              <w:t>0</w:t>
+            </w:r>
+            <w:r>
+              <w:fldChar w:fldCharType="end"/>
+            </w:r>
+          </w:p>
+        </w:tc>
+        <w:tc>
+          <w:tcPr>
+            <w:tcW w:w="1800" w:type="dxa"/>
+          </w:tcPr>
+          <w:p>
+            <w:pPr>
+              <w:jc w:val="center"/>
+            </w:pPr>
+            <w:r>
+              <w:fldChar w:fldCharType="begin"/>
+            </w:r>
+            <w:r>
+              <w:instrText xml:space="preserve"> =SUM(ABOVE) </w:instrText>
+            </w:r>
+            <w:r>
+              <w:fldChar w:fldCharType="separate"/>
+            </w:r>
+            <w:r>
+              <w:rPr>
+                <w:noProof/>
+              </w:rPr>
+              <w:t>99.62747</w:t>
+            </w:r>
+            <w:r>
+              <w:fldChar w:fldCharType="end"/>
+            </w:r>
+          </w:p>
+        </w:tc>
+        <w:tc>
+          <w:tcPr>
+            <w:tcW w:w="1789" w:type="dxa"/>
+          </w:tcPr>
+          <w:p>
+            <w:pPr>
+              <w:jc w:val="center"/>
+              <w:rPr>
+                <w:rFonts w:ascii="Calibri" w:hAnsi="Calibri" w:cs="Calibri"/>
+                <w:color w:val="000000"/>
+              </w:rPr>
+            </w:pPr>
+            <w:r>
+              <w:rPr>
+                <w:rFonts w:ascii="Calibri" w:hAnsi="Calibri" w:cs="Calibri"/>
+                <w:color w:val="000000"/>
+              </w:rPr>
+              <w:t>1518.2</w:t>
+            </w:r>
+          </w:p>
+        </w:tc>
+      </w:tr>
+    </w:tbl>
+    <w:p>
+      <w:pPr>
+        <w:jc w:val="center"/>
+      </w:pPr>
+    </w:p>
+    <w:p/>
+    <w:tbl>
+      <w:tblPr>
+        <w:tblStyle w:val="TableGrid"/>
+        <w:tblW w:w="9535" w:type="dxa"/>
+        <w:tblLook w:val="04A0" w:firstRow="1" w:lastRow="0" w:firstColumn="1" w:lastColumn="0" w:noHBand="0" w:noVBand="1"/>
+      </w:tblPr>
+      <w:tblGrid>
+        <w:gridCol w:w="2425"/>
+        <w:gridCol w:w="1350"/>
+        <w:gridCol w:w="1350"/>
+        <w:gridCol w:w="1350"/>
+        <w:gridCol w:w="1350"/>
+        <w:gridCol w:w="1710"/>
+      </w:tblGrid>
+      <w:tr>
+        <w:trPr>
+          <w:trHeight w:val="1275"/>
+        </w:trPr>
+        <w:tc>
+          <w:tcPr>
+            <w:tcW w:w="2425" w:type="dxa"/>
+            <w:shd w:val="clear" w:color="auto" w:fill="E2EFD9" w:themeFill="accent6" w:themeFillTint="33"/>
+          </w:tcPr>
+          <w:p>
+            <w:pPr>
+              <w:jc w:val="center"/>
+              <w:rPr>
+                <w:b/>
+                <w:bCs/>
+              </w:rPr>
+            </w:pPr>
+            <w:r>
+              <w:rPr>
+                <w:b/>
+                <w:bCs/>
+              </w:rPr>
+              <w:t>Operations</w:t>
+            </w:r>
+          </w:p>
+          <w:p>
+            <w:pPr>
+              <w:jc w:val="center"/>
+              <w:rPr>
+                <w:b/>
+                <w:bCs/>
+              </w:rPr>
+            </w:pPr>
+            <w:r>
+              <w:rPr>
+                <w:b/>
+                <w:bCs/>
+              </w:rPr>
+              <w:t>(With Middleware)</w:t>
+            </w:r>
+          </w:p>
+        </w:tc>
+        <w:tc>
+          <w:tcPr>
+            <w:tcW w:w="1350" w:type="dxa"/>
+            <w:shd w:val="clear" w:color="auto" w:fill="E2EFD9" w:themeFill="accent6" w:themeFillTint="33"/>
+          </w:tcPr>
+          <w:p>
+            <w:pPr>
+              <w:jc w:val="center"/>
+              <w:rPr>
+                <w:b/>
+                <w:bCs/>
+              </w:rPr>
+            </w:pPr>
+            <w:r>
+              <w:rPr>
+                <w:b/>
+                <w:bCs/>
+              </w:rPr>
+              <w:t>Minimum Response Time (</w:t>
+            </w:r>
+            <w:proofErr w:type="spellStart"/>
+            <w:r>
+              <w:rPr>
+                <w:b/>
+                <w:bCs/>
+              </w:rPr>
+              <w:t>ms</w:t>
+            </w:r>
+            <w:proofErr w:type="spellEnd"/>
             <w:r>
               <w:rPr>
                 <w:b/>
                 <w:bCs/>
               </w:rPr>
               <w:t>)</w:t>
+            </w:r>
+          </w:p>
+        </w:tc>
+        <w:tc>
+          <w:tcPr>
+            <w:tcW w:w="1350" w:type="dxa"/>
+            <w:shd w:val="clear" w:color="auto" w:fill="E2EFD9" w:themeFill="accent6" w:themeFillTint="33"/>
+          </w:tcPr>
+          <w:p>
+            <w:pPr>
+              <w:jc w:val="center"/>
+              <w:rPr>
+                <w:b/>
+                <w:bCs/>
+              </w:rPr>
+            </w:pPr>
+            <w:r>
+              <w:rPr>
+                <w:b/>
+                <w:bCs/>
+              </w:rPr>
+              <w:t>Maximum Response Time (</w:t>
+            </w:r>
+            <w:proofErr w:type="spellStart"/>
+            <w:r>
+              <w:rPr>
+                <w:b/>
+                <w:bCs/>
+              </w:rPr>
+              <w:t>ms</w:t>
+            </w:r>
+            <w:proofErr w:type="spellEnd"/>
+            <w:r>
+              <w:rPr>
+                <w:b/>
+                <w:bCs/>
+              </w:rPr>
+              <w:t>)</w:t>
+            </w:r>
+          </w:p>
+        </w:tc>
+        <w:tc>
+          <w:tcPr>
+            <w:tcW w:w="1350" w:type="dxa"/>
+            <w:shd w:val="clear" w:color="auto" w:fill="E2EFD9" w:themeFill="accent6" w:themeFillTint="33"/>
+          </w:tcPr>
+          <w:p>
+            <w:pPr>
+              <w:jc w:val="center"/>
+              <w:rPr>
+                <w:b/>
+                <w:bCs/>
+              </w:rPr>
+            </w:pPr>
+            <w:r>
+              <w:rPr>
+                <w:b/>
+                <w:bCs/>
+              </w:rPr>
+              <w:t>Median</w:t>
+            </w:r>
+            <w:r>
+              <w:rPr>
+                <w:b/>
+                <w:bCs/>
+              </w:rPr>
+              <w:t xml:space="preserve"> Response Time (</w:t>
+            </w:r>
+            <w:proofErr w:type="spellStart"/>
+            <w:r>
+              <w:rPr>
+                <w:b/>
+                <w:bCs/>
+              </w:rPr>
+              <w:t>ms</w:t>
+            </w:r>
+            <w:proofErr w:type="spellEnd"/>
+            <w:r>
+              <w:rPr>
+                <w:b/>
+                <w:bCs/>
+              </w:rPr>
+              <w:t>)</w:t>
+            </w:r>
+          </w:p>
+        </w:tc>
+        <w:tc>
+          <w:tcPr>
+            <w:tcW w:w="1350" w:type="dxa"/>
+            <w:shd w:val="clear" w:color="auto" w:fill="E2EFD9" w:themeFill="accent6" w:themeFillTint="33"/>
+          </w:tcPr>
+          <w:p>
+            <w:pPr>
+              <w:jc w:val="center"/>
+              <w:rPr>
+                <w:b/>
+                <w:bCs/>
+              </w:rPr>
+            </w:pPr>
+            <w:r>
+              <w:rPr>
+                <w:b/>
+                <w:bCs/>
+              </w:rPr>
+              <w:t>Average Response Time (</w:t>
+            </w:r>
+            <w:proofErr w:type="spellStart"/>
+            <w:r>
+              <w:rPr>
+                <w:b/>
+                <w:bCs/>
+              </w:rPr>
+              <w:t>ms</w:t>
+            </w:r>
+            <w:proofErr w:type="spellEnd"/>
+            <w:r>
+              <w:rPr>
+                <w:b/>
+                <w:bCs/>
+              </w:rPr>
+              <w:t>)</w:t>
+            </w:r>
+          </w:p>
+        </w:tc>
+        <w:tc>
+          <w:tcPr>
+            <w:tcW w:w="1710" w:type="dxa"/>
+            <w:shd w:val="clear" w:color="auto" w:fill="E2EFD9" w:themeFill="accent6" w:themeFillTint="33"/>
+          </w:tcPr>
+          <w:p>
+            <w:pPr>
+              <w:jc w:val="center"/>
+              <w:rPr>
+                <w:b/>
+                <w:bCs/>
+              </w:rPr>
+            </w:pPr>
+            <w:r>
+              <w:rPr>
+                <w:b/>
+                <w:bCs/>
+              </w:rPr>
+              <w:t>100</w:t>
+            </w:r>
+            <w:r>
+              <w:rPr>
+                <w:b/>
+                <w:bCs/>
+                <w:vertAlign w:val="superscript"/>
+              </w:rPr>
+              <w:t>th</w:t>
+            </w:r>
+            <w:r>
+              <w:rPr>
+                <w:b/>
+                <w:bCs/>
+              </w:rPr>
+              <w:t xml:space="preserve"> Percentile: Response Time</w:t>
+            </w:r>
+          </w:p>
+        </w:tc>
+      </w:tr>
+      <w:tr>
+        <w:trPr>
+          <w:trHeight w:val="322"/>
+        </w:trPr>
+        <w:tc>
+          <w:tcPr>
+            <w:tcW w:w="2425" w:type="dxa"/>
+            <w:shd w:val="clear" w:color="auto" w:fill="E2EFD9" w:themeFill="accent6" w:themeFillTint="33"/>
+          </w:tcPr>
+          <w:p>
+            <w:pPr>
+              <w:jc w:val="center"/>
+              <w:rPr>
+                <w:b/>
+                <w:bCs/>
+              </w:rPr>
+            </w:pPr>
+            <w:r>
+              <w:rPr>
+                <w:b/>
+                <w:bCs/>
+              </w:rPr>
+              <w:t>Set Function (Single Key-Value Pair)</w:t>
+            </w:r>
+          </w:p>
+        </w:tc>
+        <w:tc>
+          <w:tcPr>
+            <w:tcW w:w="1350" w:type="dxa"/>
+          </w:tcPr>
+          <w:p>
+            <w:pPr>
+              <w:jc w:val="center"/>
+              <w:rPr>
+                <w:rFonts w:ascii="Calibri" w:hAnsi="Calibri" w:cs="Calibri"/>
+                <w:color w:val="000000"/>
+              </w:rPr>
+            </w:pPr>
+            <w:r>
+              <w:rPr>
+                <w:rFonts w:ascii="Calibri" w:hAnsi="Calibri" w:cs="Calibri"/>
+                <w:color w:val="000000"/>
+              </w:rPr>
+              <w:t>13.8359</w:t>
+            </w:r>
+          </w:p>
+          <w:p>
+            <w:pPr>
+              <w:jc w:val="center"/>
+            </w:pPr>
+          </w:p>
+        </w:tc>
+        <w:tc>
+          <w:tcPr>
+            <w:tcW w:w="1350" w:type="dxa"/>
+          </w:tcPr>
+          <w:p>
+            <w:pPr>
+              <w:jc w:val="center"/>
+              <w:rPr>
+                <w:rFonts w:ascii="Calibri" w:hAnsi="Calibri" w:cs="Calibri"/>
+                <w:color w:val="000000"/>
+              </w:rPr>
+            </w:pPr>
+            <w:r>
+              <w:rPr>
+                <w:rFonts w:ascii="Calibri" w:hAnsi="Calibri" w:cs="Calibri"/>
+                <w:color w:val="000000"/>
+              </w:rPr>
+              <w:t>1464.948</w:t>
+            </w:r>
+          </w:p>
+          <w:p>
+            <w:pPr>
+              <w:jc w:val="center"/>
+            </w:pPr>
+          </w:p>
+        </w:tc>
+        <w:tc>
+          <w:tcPr>
+            <w:tcW w:w="1350" w:type="dxa"/>
+          </w:tcPr>
+          <w:p>
+            <w:pPr>
+              <w:jc w:val="center"/>
+              <w:rPr>
+                <w:rFonts w:ascii="Calibri" w:hAnsi="Calibri" w:cs="Calibri"/>
+                <w:color w:val="000000"/>
+              </w:rPr>
+            </w:pPr>
+            <w:r>
+              <w:rPr>
+                <w:rFonts w:ascii="Calibri" w:hAnsi="Calibri" w:cs="Calibri"/>
+                <w:color w:val="000000"/>
+              </w:rPr>
+              <w:t>960</w:t>
+            </w:r>
+          </w:p>
+          <w:p>
+            <w:pPr>
+              <w:jc w:val="center"/>
+            </w:pPr>
+          </w:p>
+        </w:tc>
+        <w:tc>
+          <w:tcPr>
+            <w:tcW w:w="1350" w:type="dxa"/>
+          </w:tcPr>
+          <w:p>
+            <w:pPr>
+              <w:jc w:val="center"/>
+              <w:rPr>
+                <w:rFonts w:ascii="Calibri" w:hAnsi="Calibri" w:cs="Calibri"/>
+                <w:color w:val="000000"/>
+              </w:rPr>
+            </w:pPr>
+            <w:r>
+              <w:rPr>
+                <w:rFonts w:ascii="Calibri" w:hAnsi="Calibri" w:cs="Calibri"/>
+                <w:color w:val="000000"/>
+              </w:rPr>
+              <w:t>943.42289</w:t>
+            </w:r>
+          </w:p>
+          <w:p>
+            <w:pPr>
+              <w:jc w:val="center"/>
+            </w:pPr>
+          </w:p>
+        </w:tc>
+        <w:tc>
+          <w:tcPr>
+            <w:tcW w:w="1710" w:type="dxa"/>
+          </w:tcPr>
+          <w:p>
+            <w:pPr>
+              <w:jc w:val="center"/>
+            </w:pPr>
+          </w:p>
+        </w:tc>
+      </w:tr>
+      <w:tr>
+        <w:trPr>
+          <w:trHeight w:val="305"/>
+        </w:trPr>
+        <w:tc>
+          <w:tcPr>
+            <w:tcW w:w="2425" w:type="dxa"/>
+            <w:shd w:val="clear" w:color="auto" w:fill="E2EFD9" w:themeFill="accent6" w:themeFillTint="33"/>
+          </w:tcPr>
+          <w:p>
+            <w:pPr>
+              <w:jc w:val="center"/>
+              <w:rPr>
+                <w:b/>
+                <w:bCs/>
+              </w:rPr>
+            </w:pPr>
+            <w:r>
+              <w:rPr>
+                <w:b/>
+                <w:bCs/>
+              </w:rPr>
+              <w:t>Set Function</w:t>
+            </w:r>
+          </w:p>
+          <w:p>
+            <w:pPr>
+              <w:jc w:val="center"/>
+              <w:rPr>
+                <w:b/>
+                <w:bCs/>
+              </w:rPr>
+            </w:pPr>
+            <w:r>
+              <w:rPr>
+                <w:b/>
+                <w:bCs/>
+              </w:rPr>
+              <w:t>(Multiple Key-Value Pairs)</w:t>
+            </w:r>
+          </w:p>
+        </w:tc>
+        <w:tc>
+          <w:tcPr>
+            <w:tcW w:w="1350" w:type="dxa"/>
+          </w:tcPr>
+          <w:p>
+            <w:pPr>
+              <w:jc w:val="center"/>
+              <w:rPr>
+                <w:rFonts w:ascii="Calibri" w:hAnsi="Calibri" w:cs="Calibri"/>
+                <w:color w:val="000000"/>
+              </w:rPr>
+            </w:pPr>
+            <w:r>
+              <w:rPr>
+                <w:rFonts w:ascii="Calibri" w:hAnsi="Calibri" w:cs="Calibri"/>
+                <w:color w:val="000000"/>
+              </w:rPr>
+              <w:t>19.3726</w:t>
+            </w:r>
+          </w:p>
+          <w:p>
+            <w:pPr>
+              <w:jc w:val="center"/>
+            </w:pPr>
+          </w:p>
+        </w:tc>
+        <w:tc>
+          <w:tcPr>
+            <w:tcW w:w="1350" w:type="dxa"/>
+          </w:tcPr>
+          <w:p>
+            <w:pPr>
+              <w:jc w:val="center"/>
+              <w:rPr>
+                <w:rFonts w:ascii="Calibri" w:hAnsi="Calibri" w:cs="Calibri"/>
+                <w:color w:val="000000"/>
+              </w:rPr>
+            </w:pPr>
+            <w:r>
+              <w:rPr>
+                <w:rFonts w:ascii="Calibri" w:hAnsi="Calibri" w:cs="Calibri"/>
+                <w:color w:val="000000"/>
+              </w:rPr>
+              <w:t>1583.91</w:t>
+            </w:r>
+          </w:p>
+          <w:p>
+            <w:pPr>
+              <w:jc w:val="center"/>
+            </w:pPr>
+          </w:p>
+        </w:tc>
+        <w:tc>
+          <w:tcPr>
+            <w:tcW w:w="1350" w:type="dxa"/>
+          </w:tcPr>
+          <w:p>
+            <w:pPr>
+              <w:jc w:val="center"/>
+              <w:rPr>
+                <w:rFonts w:ascii="Calibri" w:hAnsi="Calibri" w:cs="Calibri"/>
+                <w:color w:val="000000"/>
+              </w:rPr>
+            </w:pPr>
+            <w:r>
+              <w:rPr>
+                <w:rFonts w:ascii="Calibri" w:hAnsi="Calibri" w:cs="Calibri"/>
+                <w:color w:val="000000"/>
+              </w:rPr>
+              <w:t>1000</w:t>
+            </w:r>
+          </w:p>
+          <w:p>
+            <w:pPr>
+              <w:jc w:val="center"/>
+            </w:pPr>
+          </w:p>
+        </w:tc>
+        <w:tc>
+          <w:tcPr>
+            <w:tcW w:w="1350" w:type="dxa"/>
+          </w:tcPr>
+          <w:p>
+            <w:pPr>
+              <w:jc w:val="center"/>
+              <w:rPr>
+                <w:rFonts w:ascii="Calibri" w:hAnsi="Calibri" w:cs="Calibri"/>
+                <w:color w:val="000000"/>
+              </w:rPr>
+            </w:pPr>
+            <w:r>
+              <w:rPr>
+                <w:rFonts w:ascii="Calibri" w:hAnsi="Calibri" w:cs="Calibri"/>
+                <w:color w:val="000000"/>
+              </w:rPr>
+              <w:t>984.07714</w:t>
+            </w:r>
+          </w:p>
+          <w:p>
+            <w:pPr>
+              <w:jc w:val="center"/>
+            </w:pPr>
+          </w:p>
+        </w:tc>
+        <w:tc>
+          <w:tcPr>
+            <w:tcW w:w="1710" w:type="dxa"/>
+          </w:tcPr>
+          <w:p>
+            <w:pPr>
+              <w:jc w:val="center"/>
+            </w:pPr>
+          </w:p>
+        </w:tc>
+      </w:tr>
+      <w:tr>
+        <w:trPr>
+          <w:trHeight w:val="322"/>
+        </w:trPr>
+        <w:tc>
+          <w:tcPr>
+            <w:tcW w:w="2425" w:type="dxa"/>
+            <w:shd w:val="clear" w:color="auto" w:fill="E2EFD9" w:themeFill="accent6" w:themeFillTint="33"/>
+          </w:tcPr>
+          <w:p>
+            <w:pPr>
+              <w:jc w:val="center"/>
+              <w:rPr>
+                <w:b/>
+                <w:bCs/>
+              </w:rPr>
+            </w:pPr>
+            <w:r>
+              <w:rPr>
+                <w:b/>
+                <w:bCs/>
+              </w:rPr>
+              <w:t>Get Function (Single Key-Value Pair)</w:t>
+            </w:r>
+          </w:p>
+        </w:tc>
+        <w:tc>
+          <w:tcPr>
+            <w:tcW w:w="1350" w:type="dxa"/>
+          </w:tcPr>
+          <w:p>
+            <w:pPr>
+              <w:jc w:val="center"/>
+              <w:rPr>
+                <w:rFonts w:ascii="Calibri" w:hAnsi="Calibri" w:cs="Calibri"/>
+                <w:color w:val="000000"/>
+              </w:rPr>
+            </w:pPr>
+            <w:r>
+              <w:rPr>
+                <w:rFonts w:ascii="Calibri" w:hAnsi="Calibri" w:cs="Calibri"/>
+                <w:color w:val="000000"/>
+              </w:rPr>
+              <w:t>13.5749</w:t>
+            </w:r>
+          </w:p>
+          <w:p>
+            <w:pPr>
+              <w:jc w:val="center"/>
+            </w:pPr>
+          </w:p>
+        </w:tc>
+        <w:tc>
+          <w:tcPr>
+            <w:tcW w:w="1350" w:type="dxa"/>
+          </w:tcPr>
+          <w:p>
+            <w:pPr>
+              <w:jc w:val="center"/>
+              <w:rPr>
+                <w:rFonts w:ascii="Calibri" w:hAnsi="Calibri" w:cs="Calibri"/>
+                <w:color w:val="000000"/>
+              </w:rPr>
+            </w:pPr>
+            <w:r>
+              <w:rPr>
+                <w:rFonts w:ascii="Calibri" w:hAnsi="Calibri" w:cs="Calibri"/>
+                <w:color w:val="000000"/>
+              </w:rPr>
+              <w:t>1465.635</w:t>
+            </w:r>
+          </w:p>
+          <w:p>
+            <w:pPr>
+              <w:jc w:val="center"/>
+            </w:pPr>
+          </w:p>
+        </w:tc>
+        <w:tc>
+          <w:tcPr>
+            <w:tcW w:w="1350" w:type="dxa"/>
+          </w:tcPr>
+          <w:p>
+            <w:pPr>
+              <w:jc w:val="center"/>
+              <w:rPr>
+                <w:rFonts w:ascii="Calibri" w:hAnsi="Calibri" w:cs="Calibri"/>
+                <w:color w:val="000000"/>
+              </w:rPr>
+            </w:pPr>
+            <w:r>
+              <w:rPr>
+                <w:rFonts w:ascii="Calibri" w:hAnsi="Calibri" w:cs="Calibri"/>
+                <w:color w:val="000000"/>
+              </w:rPr>
+              <w:t>960</w:t>
+            </w:r>
+          </w:p>
+          <w:p>
+            <w:pPr>
+              <w:jc w:val="center"/>
+            </w:pPr>
+          </w:p>
+        </w:tc>
+        <w:tc>
+          <w:tcPr>
+            <w:tcW w:w="1350" w:type="dxa"/>
+          </w:tcPr>
+          <w:p>
+            <w:pPr>
+              <w:jc w:val="center"/>
+              <w:rPr>
+                <w:rFonts w:ascii="Calibri" w:hAnsi="Calibri" w:cs="Calibri"/>
+                <w:color w:val="000000"/>
+              </w:rPr>
+            </w:pPr>
+            <w:r>
+              <w:rPr>
+                <w:rFonts w:ascii="Calibri" w:hAnsi="Calibri" w:cs="Calibri"/>
+                <w:color w:val="000000"/>
+              </w:rPr>
+              <w:t>945.98871</w:t>
+            </w:r>
+          </w:p>
+          <w:p>
+            <w:pPr>
+              <w:jc w:val="center"/>
+            </w:pPr>
+          </w:p>
+        </w:tc>
+        <w:tc>
+          <w:tcPr>
+            <w:tcW w:w="1710" w:type="dxa"/>
+          </w:tcPr>
+          <w:p>
+            <w:pPr>
+              <w:jc w:val="center"/>
+            </w:pPr>
+          </w:p>
+        </w:tc>
+      </w:tr>
+      <w:tr>
+        <w:trPr>
+          <w:trHeight w:val="322"/>
+        </w:trPr>
+        <w:tc>
+          <w:tcPr>
+            <w:tcW w:w="2425" w:type="dxa"/>
+            <w:shd w:val="clear" w:color="auto" w:fill="E2EFD9" w:themeFill="accent6" w:themeFillTint="33"/>
+          </w:tcPr>
+          <w:p>
+            <w:pPr>
+              <w:jc w:val="center"/>
+              <w:rPr>
+                <w:b/>
+                <w:bCs/>
+              </w:rPr>
+            </w:pPr>
+            <w:r>
+              <w:rPr>
+                <w:b/>
+                <w:bCs/>
+              </w:rPr>
+              <w:lastRenderedPageBreak/>
+              <w:t xml:space="preserve">Get-Range Function (Range </w:t>
+            </w:r>
+            <w:proofErr w:type="gramStart"/>
+            <w:r>
+              <w:rPr>
+                <w:b/>
+                <w:bCs/>
+              </w:rPr>
+              <w:t>Of</w:t>
+            </w:r>
+            <w:proofErr w:type="gramEnd"/>
+            <w:r>
+              <w:rPr>
+                <w:b/>
+                <w:bCs/>
+              </w:rPr>
+              <w:t xml:space="preserve"> Key-Value Pairs)</w:t>
+            </w:r>
+          </w:p>
+        </w:tc>
+        <w:tc>
+          <w:tcPr>
+            <w:tcW w:w="1350" w:type="dxa"/>
+          </w:tcPr>
+          <w:p>
+            <w:pPr>
+              <w:jc w:val="center"/>
+              <w:rPr>
+                <w:rFonts w:ascii="Calibri" w:hAnsi="Calibri" w:cs="Calibri"/>
+                <w:color w:val="000000"/>
+              </w:rPr>
+            </w:pPr>
+            <w:r>
+              <w:rPr>
+                <w:rFonts w:ascii="Calibri" w:hAnsi="Calibri" w:cs="Calibri"/>
+                <w:color w:val="000000"/>
+              </w:rPr>
+              <w:t>14.5281</w:t>
+            </w:r>
+          </w:p>
+          <w:p>
+            <w:pPr>
+              <w:jc w:val="center"/>
+            </w:pPr>
+          </w:p>
+        </w:tc>
+        <w:tc>
+          <w:tcPr>
+            <w:tcW w:w="1350" w:type="dxa"/>
+          </w:tcPr>
+          <w:p>
+            <w:pPr>
+              <w:jc w:val="center"/>
+              <w:rPr>
+                <w:rFonts w:ascii="Calibri" w:hAnsi="Calibri" w:cs="Calibri"/>
+                <w:color w:val="000000"/>
+              </w:rPr>
+            </w:pPr>
+            <w:r>
+              <w:rPr>
+                <w:rFonts w:ascii="Calibri" w:hAnsi="Calibri" w:cs="Calibri"/>
+                <w:color w:val="000000"/>
+              </w:rPr>
+              <w:t>1486.538</w:t>
+            </w:r>
+          </w:p>
+          <w:p>
+            <w:pPr>
+              <w:jc w:val="center"/>
+            </w:pPr>
+          </w:p>
+        </w:tc>
+        <w:tc>
+          <w:tcPr>
+            <w:tcW w:w="1350" w:type="dxa"/>
+          </w:tcPr>
+          <w:p>
+            <w:pPr>
+              <w:jc w:val="center"/>
+              <w:rPr>
+                <w:rFonts w:ascii="Calibri" w:hAnsi="Calibri" w:cs="Calibri"/>
+                <w:color w:val="000000"/>
+              </w:rPr>
+            </w:pPr>
+            <w:r>
+              <w:rPr>
+                <w:rFonts w:ascii="Calibri" w:hAnsi="Calibri" w:cs="Calibri"/>
+                <w:color w:val="000000"/>
+              </w:rPr>
+              <w:t>980</w:t>
+            </w:r>
+          </w:p>
+          <w:p>
+            <w:pPr>
+              <w:jc w:val="center"/>
+            </w:pPr>
+          </w:p>
+        </w:tc>
+        <w:tc>
+          <w:tcPr>
+            <w:tcW w:w="1350" w:type="dxa"/>
+          </w:tcPr>
+          <w:p>
+            <w:pPr>
+              <w:jc w:val="center"/>
+              <w:rPr>
+                <w:rFonts w:ascii="Calibri" w:hAnsi="Calibri" w:cs="Calibri"/>
+                <w:color w:val="000000"/>
+              </w:rPr>
+            </w:pPr>
+            <w:r>
+              <w:rPr>
+                <w:rFonts w:ascii="Calibri" w:hAnsi="Calibri" w:cs="Calibri"/>
+                <w:color w:val="000000"/>
+              </w:rPr>
+              <w:t>960.24156</w:t>
+            </w:r>
+          </w:p>
+          <w:p>
+            <w:pPr>
+              <w:jc w:val="center"/>
+            </w:pPr>
+          </w:p>
+        </w:tc>
+        <w:tc>
+          <w:tcPr>
+            <w:tcW w:w="1710" w:type="dxa"/>
+          </w:tcPr>
+          <w:p>
+            <w:pPr>
+              <w:jc w:val="center"/>
+            </w:pPr>
+          </w:p>
+        </w:tc>
+      </w:tr>
+      <w:tr>
+        <w:trPr>
+          <w:trHeight w:val="305"/>
+        </w:trPr>
+        <w:tc>
+          <w:tcPr>
+            <w:tcW w:w="2425" w:type="dxa"/>
+            <w:shd w:val="clear" w:color="auto" w:fill="E2EFD9" w:themeFill="accent6" w:themeFillTint="33"/>
+          </w:tcPr>
+          <w:p>
+            <w:pPr>
+              <w:jc w:val="center"/>
+              <w:rPr>
+                <w:b/>
+                <w:bCs/>
+              </w:rPr>
+            </w:pPr>
+            <w:r>
+              <w:rPr>
+                <w:b/>
+                <w:bCs/>
+              </w:rPr>
+              <w:t>Get Function (Multiple Key-Value Pairs)</w:t>
+            </w:r>
+          </w:p>
+        </w:tc>
+        <w:tc>
+          <w:tcPr>
+            <w:tcW w:w="1350" w:type="dxa"/>
+          </w:tcPr>
+          <w:p>
+            <w:pPr>
+              <w:jc w:val="center"/>
+              <w:rPr>
+                <w:rFonts w:ascii="Calibri" w:hAnsi="Calibri" w:cs="Calibri"/>
+                <w:color w:val="000000"/>
+              </w:rPr>
+            </w:pPr>
+            <w:r>
+              <w:rPr>
+                <w:rFonts w:ascii="Calibri" w:hAnsi="Calibri" w:cs="Calibri"/>
+                <w:color w:val="000000"/>
+              </w:rPr>
+              <w:t>49.9202</w:t>
+            </w:r>
+          </w:p>
+          <w:p>
+            <w:pPr>
+              <w:jc w:val="center"/>
+            </w:pPr>
+          </w:p>
+        </w:tc>
+        <w:tc>
+          <w:tcPr>
+            <w:tcW w:w="1350" w:type="dxa"/>
+          </w:tcPr>
+          <w:p>
+            <w:pPr>
+              <w:jc w:val="center"/>
+              <w:rPr>
+                <w:rFonts w:ascii="Calibri" w:hAnsi="Calibri" w:cs="Calibri"/>
+                <w:color w:val="000000"/>
+              </w:rPr>
+            </w:pPr>
+            <w:r>
+              <w:rPr>
+                <w:rFonts w:ascii="Calibri" w:hAnsi="Calibri" w:cs="Calibri"/>
+                <w:color w:val="000000"/>
+              </w:rPr>
+              <w:t>1558.953</w:t>
+            </w:r>
+          </w:p>
+          <w:p>
+            <w:pPr>
+              <w:jc w:val="center"/>
+            </w:pPr>
+          </w:p>
+        </w:tc>
+        <w:tc>
+          <w:tcPr>
+            <w:tcW w:w="1350" w:type="dxa"/>
+          </w:tcPr>
+          <w:p>
+            <w:pPr>
+              <w:jc w:val="center"/>
+              <w:rPr>
+                <w:rFonts w:ascii="Calibri" w:hAnsi="Calibri" w:cs="Calibri"/>
+                <w:color w:val="000000"/>
+              </w:rPr>
+            </w:pPr>
+            <w:r>
+              <w:rPr>
+                <w:rFonts w:ascii="Calibri" w:hAnsi="Calibri" w:cs="Calibri"/>
+                <w:color w:val="000000"/>
+              </w:rPr>
+              <w:t>980</w:t>
+            </w:r>
+          </w:p>
+          <w:p>
+            <w:pPr>
+              <w:jc w:val="center"/>
+            </w:pPr>
+          </w:p>
+        </w:tc>
+        <w:tc>
+          <w:tcPr>
+            <w:tcW w:w="1350" w:type="dxa"/>
+          </w:tcPr>
+          <w:p>
+            <w:pPr>
+              <w:jc w:val="center"/>
+              <w:rPr>
+                <w:rFonts w:ascii="Calibri" w:hAnsi="Calibri" w:cs="Calibri"/>
+                <w:color w:val="000000"/>
+              </w:rPr>
+            </w:pPr>
+            <w:r>
+              <w:rPr>
+                <w:rFonts w:ascii="Calibri" w:hAnsi="Calibri" w:cs="Calibri"/>
+                <w:color w:val="000000"/>
+              </w:rPr>
+              <w:t>963.32365</w:t>
+            </w:r>
+          </w:p>
+          <w:p>
+            <w:pPr>
+              <w:jc w:val="center"/>
+            </w:pPr>
+          </w:p>
+        </w:tc>
+        <w:tc>
+          <w:tcPr>
+            <w:tcW w:w="1710" w:type="dxa"/>
+          </w:tcPr>
+          <w:p>
+            <w:pPr>
+              <w:jc w:val="center"/>
+            </w:pPr>
+          </w:p>
+        </w:tc>
+      </w:tr>
+      <w:tr>
+        <w:trPr>
+          <w:trHeight w:val="305"/>
+        </w:trPr>
+        <w:tc>
+          <w:tcPr>
+            <w:tcW w:w="2425" w:type="dxa"/>
+            <w:shd w:val="clear" w:color="auto" w:fill="E2EFD9" w:themeFill="accent6" w:themeFillTint="33"/>
+          </w:tcPr>
+          <w:p>
+            <w:pPr>
+              <w:jc w:val="center"/>
+              <w:rPr>
+                <w:b/>
+                <w:bCs/>
+              </w:rPr>
+            </w:pPr>
+            <w:r>
+              <w:rPr>
+                <w:b/>
+                <w:bCs/>
+              </w:rPr>
+              <w:t>Delete Function (Single/Multiple Key-Value Pairs)</w:t>
+            </w:r>
+          </w:p>
+        </w:tc>
+        <w:tc>
+          <w:tcPr>
+            <w:tcW w:w="1350" w:type="dxa"/>
+          </w:tcPr>
+          <w:p>
+            <w:pPr>
+              <w:jc w:val="center"/>
+              <w:rPr>
+                <w:rFonts w:ascii="Calibri" w:hAnsi="Calibri" w:cs="Calibri"/>
+                <w:color w:val="000000"/>
+              </w:rPr>
+            </w:pPr>
+            <w:r>
+              <w:rPr>
+                <w:rFonts w:ascii="Calibri" w:hAnsi="Calibri" w:cs="Calibri"/>
+                <w:color w:val="000000"/>
+              </w:rPr>
+              <w:t>16.6099</w:t>
+            </w:r>
+          </w:p>
+          <w:p>
+            <w:pPr>
+              <w:jc w:val="center"/>
+            </w:pPr>
+          </w:p>
+        </w:tc>
+        <w:tc>
+          <w:tcPr>
+            <w:tcW w:w="1350" w:type="dxa"/>
+          </w:tcPr>
+          <w:p>
+            <w:pPr>
+              <w:jc w:val="center"/>
+              <w:rPr>
+                <w:rFonts w:ascii="Calibri" w:hAnsi="Calibri" w:cs="Calibri"/>
+                <w:color w:val="000000"/>
+              </w:rPr>
+            </w:pPr>
+            <w:r>
+              <w:rPr>
+                <w:rFonts w:ascii="Calibri" w:hAnsi="Calibri" w:cs="Calibri"/>
+                <w:color w:val="000000"/>
+              </w:rPr>
+              <w:t>1482.574</w:t>
+            </w:r>
+          </w:p>
+          <w:p>
+            <w:pPr>
+              <w:jc w:val="center"/>
+            </w:pPr>
+          </w:p>
+        </w:tc>
+        <w:tc>
+          <w:tcPr>
+            <w:tcW w:w="1350" w:type="dxa"/>
+          </w:tcPr>
+          <w:p>
+            <w:pPr>
+              <w:jc w:val="center"/>
+            </w:pPr>
+            <w:r>
+              <w:t>970</w:t>
+            </w:r>
+          </w:p>
+        </w:tc>
+        <w:tc>
+          <w:tcPr>
+            <w:tcW w:w="1350" w:type="dxa"/>
+          </w:tcPr>
+          <w:p>
+            <w:pPr>
+              <w:jc w:val="center"/>
+              <w:rPr>
+                <w:rFonts w:ascii="Calibri" w:hAnsi="Calibri" w:cs="Calibri"/>
+                <w:color w:val="000000"/>
+              </w:rPr>
+            </w:pPr>
+            <w:r>
+              <w:rPr>
+                <w:rFonts w:ascii="Calibri" w:hAnsi="Calibri" w:cs="Calibri"/>
+                <w:color w:val="000000"/>
+              </w:rPr>
+              <w:t>960.64878</w:t>
+            </w:r>
+          </w:p>
+          <w:p>
+            <w:pPr>
+              <w:jc w:val="center"/>
+            </w:pPr>
+          </w:p>
+        </w:tc>
+        <w:tc>
+          <w:tcPr>
+            <w:tcW w:w="1710" w:type="dxa"/>
+          </w:tcPr>
+          <w:p>
+            <w:pPr>
+              <w:jc w:val="center"/>
+            </w:pPr>
+          </w:p>
+        </w:tc>
+      </w:tr>
+      <w:tr>
+        <w:trPr>
+          <w:trHeight w:val="305"/>
+        </w:trPr>
+        <w:tc>
+          <w:tcPr>
+            <w:tcW w:w="2425" w:type="dxa"/>
+            <w:shd w:val="clear" w:color="auto" w:fill="E2EFD9" w:themeFill="accent6" w:themeFillTint="33"/>
+          </w:tcPr>
+          <w:p>
+            <w:pPr>
+              <w:jc w:val="center"/>
+              <w:rPr>
+                <w:b/>
+                <w:bCs/>
+              </w:rPr>
+            </w:pPr>
+            <w:r>
+              <w:rPr>
+                <w:b/>
+                <w:bCs/>
+              </w:rPr>
+              <w:t>Aggregated</w:t>
+            </w:r>
+          </w:p>
+        </w:tc>
+        <w:tc>
+          <w:tcPr>
+            <w:tcW w:w="1350" w:type="dxa"/>
+          </w:tcPr>
+          <w:p>
+            <w:pPr>
+              <w:jc w:val="center"/>
+              <w:rPr>
+                <w:rFonts w:ascii="Calibri" w:hAnsi="Calibri" w:cs="Calibri"/>
+                <w:color w:val="000000"/>
+              </w:rPr>
+            </w:pPr>
+            <w:r>
+              <w:rPr>
+                <w:rFonts w:ascii="Calibri" w:hAnsi="Calibri" w:cs="Calibri"/>
+                <w:color w:val="000000"/>
+              </w:rPr>
+              <w:t>13.5749</w:t>
+            </w:r>
+          </w:p>
+        </w:tc>
+        <w:tc>
+          <w:tcPr>
+            <w:tcW w:w="1350" w:type="dxa"/>
+          </w:tcPr>
+          <w:p>
+            <w:pPr>
+              <w:jc w:val="center"/>
+              <w:rPr>
+                <w:rFonts w:ascii="Calibri" w:hAnsi="Calibri" w:cs="Calibri"/>
+                <w:color w:val="000000"/>
+              </w:rPr>
+            </w:pPr>
+            <w:r>
+              <w:rPr>
+                <w:rFonts w:ascii="Calibri" w:hAnsi="Calibri" w:cs="Calibri"/>
+                <w:color w:val="000000"/>
+              </w:rPr>
+              <w:t>1583.91</w:t>
+            </w:r>
+          </w:p>
+        </w:tc>
+        <w:tc>
+          <w:tcPr>
+            <w:tcW w:w="1350" w:type="dxa"/>
+          </w:tcPr>
+          <w:p>
+            <w:pPr>
+              <w:jc w:val="center"/>
+            </w:pPr>
+            <w:r>
+              <w:t>980</w:t>
+            </w:r>
+          </w:p>
+        </w:tc>
+        <w:tc>
+          <w:tcPr>
+            <w:tcW w:w="1350" w:type="dxa"/>
+          </w:tcPr>
+          <w:p>
+            <w:pPr>
+              <w:jc w:val="center"/>
+              <w:rPr>
+                <w:rFonts w:ascii="Calibri" w:hAnsi="Calibri" w:cs="Calibri"/>
+                <w:color w:val="000000"/>
+              </w:rPr>
+            </w:pPr>
+            <w:r>
+              <w:rPr>
+                <w:rFonts w:ascii="Calibri" w:hAnsi="Calibri" w:cs="Calibri"/>
+                <w:color w:val="000000"/>
+              </w:rPr>
+              <w:t>959.59788</w:t>
+            </w:r>
+          </w:p>
+        </w:tc>
+        <w:tc>
+          <w:tcPr>
+            <w:tcW w:w="1710" w:type="dxa"/>
+          </w:tcPr>
+          <w:p>
+            <w:pPr>
+              <w:jc w:val="center"/>
+              <w:rPr>
+                <w:rFonts w:ascii="Calibri" w:hAnsi="Calibri" w:cs="Calibri"/>
+                <w:color w:val="000000"/>
+              </w:rPr>
+            </w:pPr>
+            <w:r>
+              <w:rPr>
+                <w:rFonts w:ascii="Calibri" w:hAnsi="Calibri" w:cs="Calibri"/>
+                <w:color w:val="000000"/>
+              </w:rPr>
+              <w:t>1600</w:t>
+            </w:r>
+          </w:p>
+        </w:tc>
+      </w:tr>
+    </w:tbl>
+    <w:p/>
+    <w:p>
+      <w:r>
+        <w:br w:type="page"/>
+      </w:r>
+    </w:p>
+    <w:p/>
+    <w:tbl>
+      <w:tblPr>
+        <w:tblStyle w:val="TableGrid"/>
+        <w:tblW w:w="9524" w:type="dxa"/>
+        <w:tblLook w:val="04A0" w:firstRow="1" w:lastRow="0" w:firstColumn="1" w:lastColumn="0" w:noHBand="0" w:noVBand="1"/>
+      </w:tblPr>
+      <w:tblGrid>
+        <w:gridCol w:w="2425"/>
+        <w:gridCol w:w="1710"/>
+        <w:gridCol w:w="1800"/>
+        <w:gridCol w:w="1800"/>
+        <w:gridCol w:w="1789"/>
+      </w:tblGrid>
+      <w:tr>
+        <w:trPr>
+          <w:trHeight w:val="1275"/>
+        </w:trPr>
+        <w:tc>
+          <w:tcPr>
+            <w:tcW w:w="2425" w:type="dxa"/>
+            <w:shd w:val="clear" w:color="auto" w:fill="E2EFD9" w:themeFill="accent6" w:themeFillTint="33"/>
+          </w:tcPr>
+          <w:p>
+            <w:pPr>
+              <w:jc w:val="center"/>
+              <w:rPr>
+                <w:b/>
+                <w:bCs/>
+              </w:rPr>
+            </w:pPr>
+            <w:r>
+              <w:rPr>
+                <w:b/>
+                <w:bCs/>
+              </w:rPr>
+              <w:t>Operations</w:t>
+            </w:r>
+            <w:r>
+              <w:rPr>
+                <w:b/>
+                <w:bCs/>
+              </w:rPr>
+              <w:br/>
+              <w:t>(With Middleware)</w:t>
+            </w:r>
+          </w:p>
+        </w:tc>
+        <w:tc>
+          <w:tcPr>
+            <w:tcW w:w="1710" w:type="dxa"/>
+            <w:shd w:val="clear" w:color="auto" w:fill="E2EFD9" w:themeFill="accent6" w:themeFillTint="33"/>
+          </w:tcPr>
+          <w:p>
+            <w:pPr>
+              <w:jc w:val="center"/>
+              <w:rPr>
+                <w:b/>
+                <w:bCs/>
+              </w:rPr>
+            </w:pPr>
+            <w:r>
+              <w:rPr>
+                <w:b/>
+                <w:bCs/>
+              </w:rPr>
+              <w:t>Number of Requests</w:t>
+            </w:r>
+          </w:p>
+        </w:tc>
+        <w:tc>
+          <w:tcPr>
+            <w:tcW w:w="1800" w:type="dxa"/>
+            <w:shd w:val="clear" w:color="auto" w:fill="E2EFD9" w:themeFill="accent6" w:themeFillTint="33"/>
+          </w:tcPr>
+          <w:p>
+            <w:pPr>
+              <w:jc w:val="center"/>
+              <w:rPr>
+                <w:b/>
+                <w:bCs/>
+              </w:rPr>
+            </w:pPr>
+            <w:r>
+              <w:rPr>
+                <w:b/>
+                <w:bCs/>
+              </w:rPr>
+              <w:t>Number of Failures</w:t>
+            </w:r>
+          </w:p>
+        </w:tc>
+        <w:tc>
+          <w:tcPr>
+            <w:tcW w:w="1800" w:type="dxa"/>
+            <w:shd w:val="clear" w:color="auto" w:fill="E2EFD9" w:themeFill="accent6" w:themeFillTint="33"/>
+          </w:tcPr>
+          <w:p>
+            <w:pPr>
+              <w:jc w:val="center"/>
+              <w:rPr>
+                <w:b/>
+                <w:bCs/>
+              </w:rPr>
+            </w:pPr>
+            <w:r>
+              <w:rPr>
+                <w:b/>
+                <w:bCs/>
+              </w:rPr>
+              <w:t>Requests per Second (RPS)</w:t>
+            </w:r>
+          </w:p>
+        </w:tc>
+        <w:tc>
+          <w:tcPr>
+            <w:tcW w:w="1789" w:type="dxa"/>
+            <w:shd w:val="clear" w:color="auto" w:fill="E2EFD9" w:themeFill="accent6" w:themeFillTint="33"/>
+          </w:tcPr>
+          <w:p>
+            <w:pPr>
+              <w:jc w:val="center"/>
+              <w:rPr>
+                <w:b/>
+                <w:bCs/>
+              </w:rPr>
+            </w:pPr>
+            <w:r>
+              <w:rPr>
+                <w:b/>
+                <w:bCs/>
+              </w:rPr>
+              <w:t>Average Response Size (Bytes)</w:t>
+            </w:r>
+          </w:p>
+        </w:tc>
+      </w:tr>
+      <w:tr>
+        <w:trPr>
+          <w:trHeight w:val="322"/>
+        </w:trPr>
+        <w:tc>
+          <w:tcPr>
+            <w:tcW w:w="2425" w:type="dxa"/>
+            <w:shd w:val="clear" w:color="auto" w:fill="E2EFD9" w:themeFill="accent6" w:themeFillTint="33"/>
+          </w:tcPr>
+          <w:p>
+            <w:pPr>
+              <w:jc w:val="center"/>
+              <w:rPr>
+                <w:b/>
+                <w:bCs/>
+              </w:rPr>
+            </w:pPr>
+            <w:r>
+              <w:rPr>
+                <w:b/>
+                <w:bCs/>
+              </w:rPr>
+              <w:t>Set Function (Single Key-Value Pair)</w:t>
+            </w:r>
+          </w:p>
+        </w:tc>
+        <w:tc>
+          <w:tcPr>
+            <w:tcW w:w="1710" w:type="dxa"/>
+          </w:tcPr>
+          <w:p>
+            <w:pPr>
+              <w:jc w:val="center"/>
+            </w:pPr>
+          </w:p>
+        </w:tc>
+        <w:tc>
+          <w:tcPr>
+            <w:tcW w:w="1800" w:type="dxa"/>
+          </w:tcPr>
+          <w:p>
+            <w:pPr>
+              <w:jc w:val="center"/>
+            </w:pPr>
+          </w:p>
+        </w:tc>
+        <w:tc>
+          <w:tcPr>
+            <w:tcW w:w="1800" w:type="dxa"/>
+          </w:tcPr>
+          <w:p>
+            <w:pPr>
+              <w:jc w:val="center"/>
+            </w:pPr>
+          </w:p>
+        </w:tc>
+        <w:tc>
+          <w:tcPr>
+            <w:tcW w:w="1789" w:type="dxa"/>
+          </w:tcPr>
+          <w:p>
+            <w:pPr>
+              <w:jc w:val="center"/>
+            </w:pPr>
+          </w:p>
+        </w:tc>
+      </w:tr>
+      <w:tr>
+        <w:trPr>
+          <w:trHeight w:val="305"/>
+        </w:trPr>
+        <w:tc>
+          <w:tcPr>
+            <w:tcW w:w="2425" w:type="dxa"/>
+            <w:shd w:val="clear" w:color="auto" w:fill="E2EFD9" w:themeFill="accent6" w:themeFillTint="33"/>
+          </w:tcPr>
+          <w:p>
+            <w:pPr>
+              <w:jc w:val="center"/>
+              <w:rPr>
+                <w:b/>
+                <w:bCs/>
+              </w:rPr>
+            </w:pPr>
+            <w:r>
+              <w:rPr>
+                <w:b/>
+                <w:bCs/>
+              </w:rPr>
+              <w:t>Set Function</w:t>
+            </w:r>
+          </w:p>
+          <w:p>
+            <w:pPr>
+              <w:jc w:val="center"/>
+              <w:rPr>
+                <w:b/>
+                <w:bCs/>
+              </w:rPr>
+            </w:pPr>
+            <w:r>
+              <w:rPr>
+                <w:b/>
+                <w:bCs/>
+              </w:rPr>
+              <w:t>(Multiple Key-Value Pairs)</w:t>
+            </w:r>
+          </w:p>
+        </w:tc>
+        <w:tc>
+          <w:tcPr>
+            <w:tcW w:w="1710" w:type="dxa"/>
+          </w:tcPr>
+          <w:p>
+            <w:pPr>
+              <w:jc w:val="center"/>
+            </w:pPr>
+          </w:p>
+        </w:tc>
+        <w:tc>
+          <w:tcPr>
+            <w:tcW w:w="1800" w:type="dxa"/>
+          </w:tcPr>
+          <w:p>
+            <w:pPr>
+              <w:jc w:val="center"/>
+            </w:pPr>
+          </w:p>
+        </w:tc>
+        <w:tc>
+          <w:tcPr>
+            <w:tcW w:w="1800" w:type="dxa"/>
+          </w:tcPr>
+          <w:p>
+            <w:pPr>
+              <w:jc w:val="center"/>
+            </w:pPr>
+          </w:p>
+        </w:tc>
+        <w:tc>
+          <w:tcPr>
+            <w:tcW w:w="1789" w:type="dxa"/>
+          </w:tcPr>
+          <w:p>
+            <w:pPr>
+              <w:jc w:val="center"/>
+            </w:pPr>
+          </w:p>
+        </w:tc>
+      </w:tr>
+      <w:tr>
+        <w:trPr>
+          <w:trHeight w:val="322"/>
+        </w:trPr>
+        <w:tc>
+          <w:tcPr>
+            <w:tcW w:w="2425" w:type="dxa"/>
+            <w:shd w:val="clear" w:color="auto" w:fill="E2EFD9" w:themeFill="accent6" w:themeFillTint="33"/>
+          </w:tcPr>
+          <w:p>
+            <w:pPr>
+              <w:jc w:val="center"/>
+              <w:rPr>
+                <w:b/>
+                <w:bCs/>
+              </w:rPr>
+            </w:pPr>
+            <w:r>
+              <w:rPr>
+                <w:b/>
+                <w:bCs/>
+              </w:rPr>
+              <w:t>Get Function (Single Key-Value Pair)</w:t>
+            </w:r>
+          </w:p>
+        </w:tc>
+        <w:tc>
+          <w:tcPr>
+            <w:tcW w:w="1710" w:type="dxa"/>
+          </w:tcPr>
+          <w:p>
+            <w:pPr>
+              <w:jc w:val="center"/>
+            </w:pPr>
+          </w:p>
+        </w:tc>
+        <w:tc>
+          <w:tcPr>
+            <w:tcW w:w="1800" w:type="dxa"/>
+          </w:tcPr>
+          <w:p>
+            <w:pPr>
+              <w:jc w:val="center"/>
+            </w:pPr>
+          </w:p>
+        </w:tc>
+        <w:tc>
+          <w:tcPr>
+            <w:tcW w:w="1800" w:type="dxa"/>
+          </w:tcPr>
+          <w:p>
+            <w:pPr>
+              <w:jc w:val="center"/>
+            </w:pPr>
+          </w:p>
+        </w:tc>
+        <w:tc>
+          <w:tcPr>
+            <w:tcW w:w="1789" w:type="dxa"/>
+          </w:tcPr>
+          <w:p>
+            <w:pPr>
+              <w:jc w:val="center"/>
+            </w:pPr>
+          </w:p>
+        </w:tc>
+      </w:tr>
+      <w:tr>
+        <w:trPr>
+          <w:trHeight w:val="322"/>
+        </w:trPr>
+        <w:tc>
+          <w:tcPr>
+            <w:tcW w:w="2425" w:type="dxa"/>
+            <w:shd w:val="clear" w:color="auto" w:fill="E2EFD9" w:themeFill="accent6" w:themeFillTint="33"/>
+          </w:tcPr>
+          <w:p>
+            <w:pPr>
+              <w:jc w:val="center"/>
+              <w:rPr>
+                <w:b/>
+                <w:bCs/>
+              </w:rPr>
+            </w:pPr>
+            <w:r>
+              <w:rPr>
+                <w:b/>
+                <w:bCs/>
+              </w:rPr>
+              <w:t>Get Function (Multiple Key-Value Pairs)</w:t>
             </w:r>
           </w:p>
         </w:tc>
@@ -6110,14 +8381,7 @@
                 <w:b/>
                 <w:bCs/>
               </w:rPr>
-              <w:t>Operation</w:t>
-            </w:r>
-            <w:r>
-              <w:rPr>
-                <w:b/>
-                <w:bCs/>
-              </w:rPr>
-              <w:t>s</w:t>
+              <w:t>Operations</w:t>
             </w:r>
           </w:p>
           <w:p>
@@ -6753,6 +9017,7 @@
           <w:bCs/>
           <w:color w:val="auto"/>
         </w:rPr>
+        <w:lastRenderedPageBreak/>
         <w:t>Impacts of Sharding</w:t>
       </w:r>
       <w:bookmarkEnd w:id="34"/>
@@ -8393,6 +10658,22 @@
       </w:tblBorders>
     </w:tblPr>
   </w:style>
+  <w:style w:type="paragraph" w:styleId="NormalWeb">
+    <w:name w:val="Normal (Web)"/>
+    <w:basedOn w:val="Normal"/>
+    <w:uiPriority w:val="99"/>
+    <w:semiHidden/>
+    <w:unhideWhenUsed/>
+    <w:rsid w:val="005A4E9F"/>
+    <w:pPr>
+      <w:spacing w:before="100" w:beforeAutospacing="1" w:after="100" w:afterAutospacing="1" w:line="240" w:lineRule="auto"/>
+    </w:pPr>
+    <w:rPr>
+      <w:rFonts w:ascii="Times New Roman" w:eastAsia="Times New Roman" w:hAnsi="Times New Roman" w:cs="Times New Roman"/>
+      <w:sz w:val="24"/>
+      <w:szCs w:val="24"/>
+    </w:rPr>
+  </w:style>
 </w:styles>
 </file>
 
@@ -8602,9 +10883,9 @@
     <w:rsidRoot w:val="00C63529"/>
     <w:rsid w:val="0022318C"/>
     <w:rsid w:val="00607559"/>
-    <w:rsid w:val="008609EA"/>
     <w:rsid w:val="00C63529"/>
     <w:rsid w:val="00D1109F"/>
+    <w:rsid w:val="00D60B49"/>
     <w:rsid w:val="00D83766"/>
     <w:rsid w:val="00E079AA"/>
     <w:rsid w:val="00E47792"/>

</xml_diff>